<commit_message>
Add Trello board screenshot and HW 3 complete
</commit_message>
<xml_diff>
--- a/Smart_Parking_Platform_homework.docx
+++ b/Smart_Parking_Platform_homework.docx
@@ -4515,7 +4515,7 @@
       </w:pPr>
       <w:r>
         <w:drawing>
-          <wp:inline wp14:editId="752D66B1" wp14:anchorId="1D7C58EA">
+          <wp:inline wp14:editId="335EA02B" wp14:anchorId="1D7C58EA">
             <wp:extent cx="6172200" cy="3990975"/>
             <wp:effectExtent l="0" t="0" r="0" b="0"/>
             <wp:docPr id="1491527176" name="drawing"/>
@@ -4559,6 +4559,177 @@
       <w:r>
         <w:rPr/>
         <w:t xml:space="preserve"> </w:t>
+      </w:r>
+    </w:p>
+    <w:p>
+      <w:pPr>
+        <w:pStyle w:val="Normal"/>
+        <w:spacing w:after="180"/>
+        <w:ind w:left="0" w:hanging="0"/>
+      </w:pPr>
+      <w:r>
+        <w:rPr/>
+        <w:t xml:space="preserve">Trello Kanban board for the smart parking platform with sprint 1 planned. (3 separate screenshots because not </w:t>
+      </w:r>
+      <w:r>
+        <w:rPr/>
+        <w:t>all</w:t>
+      </w:r>
+      <w:r>
+        <w:rPr/>
+        <w:t xml:space="preserve"> the cards within each column fit so I had to scroll and screenshot all of them separately. </w:t>
+      </w:r>
+      <w:r>
+        <w:rPr/>
+        <w:t xml:space="preserve">It is on the next </w:t>
+      </w:r>
+      <w:r>
+        <w:rPr/>
+        <w:t>page if</w:t>
+      </w:r>
+      <w:r>
+        <w:rPr/>
+        <w:t xml:space="preserve"> you scroll down</w:t>
+      </w:r>
+      <w:r>
+        <w:rPr/>
+        <w:t>.</w:t>
+      </w:r>
+    </w:p>
+    <w:p>
+      <w:pPr>
+        <w:pStyle w:val="Normal"/>
+        <w:spacing w:after="180"/>
+        <w:ind w:left="0" w:hanging="0"/>
+      </w:pPr>
+      <w:r>
+        <w:drawing>
+          <wp:inline wp14:editId="73F9C6AF" wp14:anchorId="3377163B">
+            <wp:extent cx="6172200" cy="3638550"/>
+            <wp:effectExtent l="0" t="0" r="0" b="0"/>
+            <wp:docPr id="1753486443" name="drawing"/>
+            <wp:cNvGraphicFramePr>
+              <a:graphicFrameLocks noChangeAspect="1"/>
+            </wp:cNvGraphicFramePr>
+            <a:graphic>
+              <a:graphicData xmlns:a="http://schemas.openxmlformats.org/drawingml/2006/main" uri="http://schemas.openxmlformats.org/drawingml/2006/picture">
+                <pic:pic xmlns:pic="http://schemas.openxmlformats.org/drawingml/2006/picture">
+                  <pic:nvPicPr>
+                    <pic:cNvPr id="1753486443" name="Picture 1753486443"/>
+                    <pic:cNvPicPr/>
+                  </pic:nvPicPr>
+                  <pic:blipFill>
+                    <a:blip xmlns:r="http://schemas.openxmlformats.org/officeDocument/2006/relationships" r:embed="rId509398946">
+                      <a:extLst>
+                        <a:ext uri="{28A0092B-C50C-407E-A947-70E740481C1C}">
+                          <a14:useLocalDpi xmlns:a14="http://schemas.microsoft.com/office/drawing/2010/main"/>
+                        </a:ext>
+                      </a:extLst>
+                    </a:blip>
+                    <a:stretch>
+                      <a:fillRect/>
+                    </a:stretch>
+                  </pic:blipFill>
+                  <pic:spPr>
+                    <a:xfrm>
+                      <a:off x="0" y="0"/>
+                      <a:ext cx="6172200" cy="3638550"/>
+                    </a:xfrm>
+                    <a:prstGeom prst="rect">
+                      <a:avLst/>
+                    </a:prstGeom>
+                  </pic:spPr>
+                </pic:pic>
+              </a:graphicData>
+            </a:graphic>
+          </wp:inline>
+        </w:drawing>
+      </w:r>
+      <w:r>
+        <w:drawing>
+          <wp:inline wp14:editId="5DD366BD" wp14:anchorId="07509FE3">
+            <wp:extent cx="6172200" cy="3657600"/>
+            <wp:effectExtent l="0" t="0" r="0" b="0"/>
+            <wp:docPr id="1192932293" name="drawing"/>
+            <wp:cNvGraphicFramePr>
+              <a:graphicFrameLocks noChangeAspect="1"/>
+            </wp:cNvGraphicFramePr>
+            <a:graphic>
+              <a:graphicData xmlns:a="http://schemas.openxmlformats.org/drawingml/2006/main" uri="http://schemas.openxmlformats.org/drawingml/2006/picture">
+                <pic:pic xmlns:pic="http://schemas.openxmlformats.org/drawingml/2006/picture">
+                  <pic:nvPicPr>
+                    <pic:cNvPr id="1192932293" name="Picture 1192932293"/>
+                    <pic:cNvPicPr/>
+                  </pic:nvPicPr>
+                  <pic:blipFill>
+                    <a:blip xmlns:r="http://schemas.openxmlformats.org/officeDocument/2006/relationships" r:embed="rId1493976088">
+                      <a:extLst>
+                        <a:ext uri="{28A0092B-C50C-407E-A947-70E740481C1C}">
+                          <a14:useLocalDpi xmlns:a14="http://schemas.microsoft.com/office/drawing/2010/main"/>
+                        </a:ext>
+                      </a:extLst>
+                    </a:blip>
+                    <a:stretch>
+                      <a:fillRect/>
+                    </a:stretch>
+                  </pic:blipFill>
+                  <pic:spPr>
+                    <a:xfrm>
+                      <a:off x="0" y="0"/>
+                      <a:ext cx="6172200" cy="3657600"/>
+                    </a:xfrm>
+                    <a:prstGeom prst="rect">
+                      <a:avLst/>
+                    </a:prstGeom>
+                  </pic:spPr>
+                </pic:pic>
+              </a:graphicData>
+            </a:graphic>
+          </wp:inline>
+        </w:drawing>
+      </w:r>
+      <w:r>
+        <w:drawing>
+          <wp:inline wp14:editId="42E2A657" wp14:anchorId="027F2ECA">
+            <wp:extent cx="6172200" cy="3648075"/>
+            <wp:effectExtent l="0" t="0" r="0" b="0"/>
+            <wp:docPr id="1128302045" name="drawing"/>
+            <wp:cNvGraphicFramePr>
+              <a:graphicFrameLocks noChangeAspect="1"/>
+            </wp:cNvGraphicFramePr>
+            <a:graphic>
+              <a:graphicData xmlns:a="http://schemas.openxmlformats.org/drawingml/2006/main" uri="http://schemas.openxmlformats.org/drawingml/2006/picture">
+                <pic:pic xmlns:pic="http://schemas.openxmlformats.org/drawingml/2006/picture">
+                  <pic:nvPicPr>
+                    <pic:cNvPr id="1128302045" name="Picture 1128302045"/>
+                    <pic:cNvPicPr/>
+                  </pic:nvPicPr>
+                  <pic:blipFill>
+                    <a:blip xmlns:r="http://schemas.openxmlformats.org/officeDocument/2006/relationships" r:embed="rId2123367596">
+                      <a:extLst>
+                        <a:ext uri="{28A0092B-C50C-407E-A947-70E740481C1C}">
+                          <a14:useLocalDpi xmlns:a14="http://schemas.microsoft.com/office/drawing/2010/main"/>
+                        </a:ext>
+                      </a:extLst>
+                    </a:blip>
+                    <a:stretch>
+                      <a:fillRect/>
+                    </a:stretch>
+                  </pic:blipFill>
+                  <pic:spPr>
+                    <a:xfrm>
+                      <a:off x="0" y="0"/>
+                      <a:ext cx="6172200" cy="3648075"/>
+                    </a:xfrm>
+                    <a:prstGeom prst="rect">
+                      <a:avLst/>
+                    </a:prstGeom>
+                  </pic:spPr>
+                </pic:pic>
+              </a:graphicData>
+            </a:graphic>
+          </wp:inline>
+        </w:drawing>
       </w:r>
     </w:p>
     <w:sectPr>

</xml_diff>